<commit_message>
Add authentic Zoho Creator experiment evidence
</commit_message>
<xml_diff>
--- a/241501185-Exp-03.docx
+++ b/241501185-Exp-03.docx
@@ -398,6 +398,62 @@
           <w:color w:val="000000"/>
         </w:rPr>
         <w:t xml:space="preserve">Inference: future low code work is likely to combine visual configuration with stronger testing, API skills and controlled use of AI; this is a reasoned outlook, not a measured prediction.</w:t>
+      </w:r>
+    </w:p>
+    <w:p>
+      <w:pPr>
+        <w:pStyle w:val="BodyText"/>
+        <w:spacing w:line="259" w:lineRule="auto" w:before="189"/>
+        <w:ind w:left="23" w:right="190"/>
+        <w:jc w:val="center"/>
+        <w:keepNext/>
+      </w:pPr>
+      <w:r>
+        <w:drawing>
+          <wp:inline distT="0" distB="0" distL="0" distR="0">
+            <wp:extent cx="5486400" cy="2407443"/>
+            <wp:docPr id="1" name="lab-03-1.jpg" descr="Actual Zia guidance in the account builder, showing the suggested checks for dashboard and report totals."/>
+            <a:graphic>
+              <a:graphicData uri="http://schemas.openxmlformats.org/drawingml/2006/picture">
+                <pic:pic>
+                  <pic:nvPicPr>
+                    <pic:cNvPr id="1" name="lab-03-1.jpg"/>
+                    <pic:cNvPicPr/>
+                  </pic:nvPicPr>
+                  <pic:blipFill>
+                    <a:blip r:embed="rId7"/>
+                    <a:stretch>
+                      <a:fillRect/>
+                    </a:stretch>
+                  </pic:blipFill>
+                  <pic:spPr>
+                    <a:xfrm>
+                      <a:off x="0" y="0"/>
+                      <a:ext cx="5486400" cy="2407443"/>
+                    </a:xfrm>
+                    <a:prstGeom prst="rect">
+                      <a:avLst/>
+                    </a:prstGeom>
+                  </pic:spPr>
+                </pic:pic>
+              </a:graphicData>
+            </a:graphic>
+          </wp:inline>
+        </w:drawing>
+      </w:r>
+    </w:p>
+    <w:p>
+      <w:pPr>
+        <w:pStyle w:val="BodyText"/>
+        <w:spacing w:line="259" w:lineRule="auto" w:before="189"/>
+        <w:ind w:left="23" w:right="190"/>
+      </w:pPr>
+      <w:r>
+        <w:rPr>
+          <w:b/>
+          <w:color w:val="000000"/>
+        </w:rPr>
+        <w:t xml:space="preserve">Figure 1 Actual Zia guidance in the account builder, showing the suggested checks for dashboard and report totals.</w:t>
       </w:r>
     </w:p>
     <w:p>

</xml_diff>